<commit_message>
Document stochastic backends and configure resilient dataset transfers
</commit_message>
<xml_diff>
--- a/docs/World_Model.docx
+++ b/docs/World_Model.docx
@@ -15,12 +15,12 @@
         <w:pStyle w:val="Subtitle"/>
       </w:pPr>
       <w:r>
-        <w:t>DriveGaussianWorld 技术文档  版本 0.2.0</w:t>
+        <w:t>DriveGaussianWorld 技术文档  版本 0.3.0</w:t>
       </w:r>
     </w:p>
     <w:p>
       <w:r>
-        <w:t>本文面向时序建模与自动驾驶研发，说明 DriveGaussianWorld 的动作条件世界模型如何融合历史图像与 Gaussian 观测，递归预测未来场景和自车运动。当前实现是确定性潜状态模型，技术描述与 models/world.py 的实际结构对应。</w:t>
+        <w:t>本文说明 GRU、RSSM 与条件 Diffusion 三类动作条件世界模型。第 1 至 9 节介绍共享数据协议、GRU 基线及预测头；第 10 至 12 节说明随机状态、扩散训练与统一实验。三者预测未来图像、Gaussian 场景及自车运动，当前完成框架验证，尚无新增大规模训练结果。</w:t>
       </w:r>
     </w:p>
     <w:p>
@@ -607,7 +607,7 @@
         <w:pStyle w:val="Heading1"/>
       </w:pPr>
       <w:r>
-        <w:t>2 多模态历史编码</w:t>
+        <w:t>2 GRU 基线的历史编码</w:t>
       </w:r>
     </w:p>
     <w:p>
@@ -631,7 +631,7 @@
     </w:p>
     <w:p>
       <w:r>
-        <w:t>观测 GRU 输入共 113 维，输出 hidden 维历史潜状态。Gaussian 集合编码是置换不变聚合，但后续解码槽位仍绑定固定采样网格。RGB-only 消融同时移除几何编码和初始 Gaussian skip，防止几何输入从另一条路径流入预测。</w:t>
+        <w:t>GRU 与 Diffusion 的历史编码输入共 113 维，输出 hidden 维潜状态；RSSM 使用第 10 节的随机状态过滤。集合编码按 mask 聚合，解码槽位仍绑定采样网格。RGB-only 同时去掉几何编码与初始 Gaussian skip。</w:t>
       </w:r>
     </w:p>
     <w:p>
@@ -640,12 +640,12 @@
         <w:pageBreakBefore/>
       </w:pPr>
       <w:r>
-        <w:t>3 动作条件递归动力学</w:t>
+        <w:t>3 GRU 基线递归动力学</w:t>
       </w:r>
     </w:p>
     <w:p>
       <w:r>
-        <w:t>rollout 先读取 observe 的末状态，此后每一步仅依赖上一步潜状态、预测状态和调用方给定的动作条件。动力学 GRU 的输入为 4 维向量 [a/5,yaw_rate,dt,speed/20]；没有未来观测 posterior，也没有 teacher forcing、KL 项或扩散过程。</w:t>
+        <w:t>GRU 基线的 rollout 每步仅依赖上一步潜状态、预测状态和给定动作。动力学 GRU 接收 [a/5,yaw_rate,dt,speed/20]，不含随机潜变量、后验或扩散过程。RSSM 与 Diffusion 的训练目标另见第 10、11 节。</w:t>
       </w:r>
     </w:p>
     <w:p>
@@ -700,7 +700,7 @@
     </w:p>
     <w:p>
       <w:r>
-        <w:t>RGB 解码器将潜状态映射到 32×4×12 的特征图，再通过三层反卷积恢复 3×32×96，预测受 tanh 约束的残差；每步增量为 0.15 倍残差，结果裁剪到 0 到 1。下一步图像以该预测为基底，不重新读取真实未来帧。</w:t>
+        <w:t>共享 RGB 解码器将潜状态映射为 32×4×12，再经三层反卷积恢复 3×32×96，预测 0.15×tanh 约束的图像残差，结果裁剪至 0 到 1。推理时递归使用预测图像作基底，不读取真实未来帧。</w:t>
       </w:r>
     </w:p>
     <w:p>
@@ -719,7 +719,7 @@
         <w:pageBreakBefore/>
       </w:pPr>
       <w:r>
-        <w:t>5 联合训练目标</w:t>
+        <w:t>5 共享重建损失</w:t>
       </w:r>
     </w:p>
     <w:p>
@@ -785,7 +785,7 @@
     </w:p>
     <w:p>
       <w:r>
-        <w:t>配置、逐步训练和验证损失、梯度范数、数据集 SHA256、选择 split、优化步数与 checkpoint SHA256 一起保留。旧检查点没有 precision 或 worker 字段时仍可加载；运行设备由当前命令显式选择，不强制继承保存机器上的 GPU 编号。</w:t>
+        <w:t>检查点保存 backend、model_options、数据集与 checkpoint SHA256、验证 split 和优化步数。旧检查点缺少 backend 时按 GRU 恢复。运行设备由当前命令指定；随机模型使用固定并恢复的验证 RNG，按相同的开环重建损失选择检查点。</w:t>
       </w:r>
     </w:p>
     <w:p>
@@ -814,7 +814,7 @@
     </w:p>
     <w:p>
       <w:r>
-        <w:t>Gaussian 训练目标主要来自前端伪几何，不等于真实 4D 标注；独立 LiDAR 深度诊断单独报告。现有数据示例仅有少量同日道路日志，窗口相互重叠，不能推导跨城市泛化、统计显著性或闭环安全性。</w:t>
+        <w:t>Gaussian 监督主要来自前端伪几何，不能替代独立 LiDAR 验证。原始工程样例与扩展日志仍来自同日道路记录，窗口重叠，地理路线可能交叉；数据扩充本身不建立跨城市泛化、显著性或闭环安全性。</w:t>
       </w:r>
     </w:p>
     <w:p>
@@ -845,12 +845,949 @@
     </w:p>
     <w:p>
       <w:r>
-        <w:t>网络与损失：models/world.py；训练：train.py；窗口隔离：data/windows.py；指标与基线：evaluate.py；设备与精度：common.py；服务：serve.py。默认配置为 configs/default.json，安装与运行命令统一维护在 README。</w:t>
+        <w:t>基线及共享预测头：models/world.py；RSSM：models/rssm.py；Diffusion：models/diffusion.py；注册与构建：models/__init__.py。训练、评估、服务和数据窗口沿用统一入口。安装与运行命令维护在 README。</w:t>
       </w:r>
     </w:p>
     <w:p>
       <w:r>
         <w:t>对应数据来源为 KITTI raw，前端来源为 xiaomi-research/dggt。模型架构、超参数与实验能力以代码和实际元数据为准；恢复 GPU 执行路径不代表已执行新的 GPU 训练或取得新的性能结果。</w:t>
+      </w:r>
+    </w:p>
+    <w:p>
+      <w:pPr>
+        <w:pStyle w:val="Heading1"/>
+        <w:pageBreakBefore/>
+      </w:pPr>
+      <w:r>
+        <w:t>10 RSSM 随机状态空间模型</w:t>
+      </w:r>
+    </w:p>
+    <w:p>
+      <w:r>
+        <w:t>RSSM 后端采用 Dreamer 风格的连续状态空间结构：确定性 GRU 隐状态负责时序记忆，随机潜变量表达未来状态的不确定性。这一实现只覆盖世界模型，不含 actor、critic、奖励或 continuation head，也不等同于 DreamerV2 或 V3 的离散潜变量实现。</w:t>
+      </w:r>
+    </w:p>
+    <w:p>
+      <w:pPr>
+        <w:pStyle w:val="Heading2"/>
+        <w:pageBreakBefore w:val="0"/>
+      </w:pPr>
+      <w:r>
+        <w:t>确定性记忆与随机状态</w:t>
+      </w:r>
+    </w:p>
+    <w:p>
+      <w:r>
+        <w:t>默认 hidden=96、stochastic=32。未来 GRU 接收上一随机状态与 4 维动作条件，得到下一确定性状态；prior MLP 据此输出高斯均值和尺度。训练 posterior 额外读取目标时刻的 113 维观测特征，输出对角高斯后验。尺度经 softplus 后加 0.1，采样采用可微重参数化。</w:t>
+      </w:r>
+    </w:p>
+    <w:p>
+      <w:pPr>
+        <w:spacing w:after="160"/>
+      </w:pPr>
+      <m:oMathPara>
+        <m:oMath>
+          <m:r>
+            <m:t xml:space="preserve">z = μ + σ ⊙ ε</m:t>
+          </m:r>
+        </m:oMath>
+      </m:oMathPara>
+    </w:p>
+    <w:p>
+      <w:r>
+        <w:t>历史过滤也递归传递随机状态。当前 observation 不提供历史动作和时间间隔，因此过滤阶段将未知控制和 dt 置零，仅使用已观测速度及图像几何特征。未来 rollout 使用调用方给定的动作条件，后续扩展历史控制协议可消除这一近似。</w:t>
+      </w:r>
+    </w:p>
+    <w:p>
+      <w:pPr>
+        <w:pStyle w:val="Heading2"/>
+        <w:pageBreakBefore w:val="0"/>
+      </w:pPr>
+      <w:r>
+        <w:t>后验训练与先验预测</w:t>
+      </w:r>
+    </w:p>
+    <w:p>
+      <w:r>
+        <w:t>training_loss 用目标未来观测形成后验，重建未来场景，并通过 balanced KL 约束先验。prior 的动力学分支对 posterior 停止梯度，表示分支对 prior 停止梯度；默认权重分别为 0.8 和 0.2。每个 KL 先沿潜维求和，再以 free_nats=1 下限截断，并对 batch 和时间平均。</w:t>
+      </w:r>
+    </w:p>
+    <w:p>
+      <w:pPr>
+        <w:spacing w:after="160"/>
+      </w:pPr>
+      <m:oMathPara>
+        <m:oMath>
+          <m:sSub>
+            <m:e>
+              <m:r>
+                <m:t xml:space="preserve">L</m:t>
+              </m:r>
+            </m:e>
+            <m:sub>
+              <m:r>
+                <m:t xml:space="preserve">RSSM</m:t>
+              </m:r>
+            </m:sub>
+          </m:sSub>
+          <m:r>
+            <m:t xml:space="preserve"> = </m:t>
+          </m:r>
+          <m:sSub>
+            <m:e>
+              <m:r>
+                <m:t xml:space="preserve">L</m:t>
+              </m:r>
+            </m:e>
+            <m:sub>
+              <m:r>
+                <m:t xml:space="preserve">world</m:t>
+              </m:r>
+            </m:sub>
+          </m:sSub>
+          <m:r>
+            <m:t xml:space="preserve"> + β </m:t>
+          </m:r>
+          <m:sSub>
+            <m:e>
+              <m:r>
+                <m:t xml:space="preserve">KL</m:t>
+              </m:r>
+            </m:e>
+            <m:sub>
+              <m:r>
+                <m:t xml:space="preserve">balanced</m:t>
+              </m:r>
+            </m:sub>
+          </m:sSub>
+        </m:oMath>
+      </m:oMathPara>
+    </w:p>
+    <w:p>
+      <w:r>
+        <w:t>默认 β=0.1。推理只在历史帧使用观测后验，此后的未来状态从先验采样，不读取未来目标。共享预测头解码 h 与 z 的融合特征。验证也使用先验开环预测；训练后验重建损失不能直接作为未来预测质量。sample=False 使用分布均值，属于确定性诊断路径。</w:t>
+      </w:r>
+    </w:p>
+    <w:p>
+      <w:r>
+        <w:t>实现入口为 models/rssm.py。需在更多行车数据上检查先验后验差距、潜变量是否退化，以及长预测时域的误差和样本多样性。</w:t>
+      </w:r>
+    </w:p>
+    <w:p>
+      <w:pPr>
+        <w:pStyle w:val="Heading1"/>
+        <w:pageBreakBefore/>
+      </w:pPr>
+      <w:r>
+        <w:t>11 条件潜空间 Diffusion 模型</w:t>
+      </w:r>
+    </w:p>
+    <w:p>
+      <w:r>
+        <w:t>Diffusion 后端对紧凑场景潜变量建模，不对完整像素直接扩散，也不调用 DGGT 上游的图像扩散精修。图像、Gaussian 和速度的 113 维特征经过 MLP 与 LayerNorm，得到 hidden 维场景码；默认维度为 96。</w:t>
+      </w:r>
+    </w:p>
+    <w:p>
+      <w:pPr>
+        <w:pStyle w:val="Heading2"/>
+        <w:pageBreakBefore w:val="0"/>
+      </w:pPr>
+      <w:r>
+        <w:t>条件噪声预测训练</w:t>
+      </w:r>
+    </w:p>
+    <w:p>
+      <w:r>
+        <w:t>因果历史 GRU 在未来持续接收动作与时间条件，conditioner 将其状态与上一场景码融合。训练从目标未来观测编码干净潜变量，随机选择噪声层并加入高斯噪声。噪声目标分支停止梯度，防止编码器通过该分支直接改变噪声监督。</w:t>
+      </w:r>
+    </w:p>
+    <w:p>
+      <w:pPr>
+        <w:spacing w:after="160"/>
+      </w:pPr>
+      <m:oMathPara>
+        <m:oMath>
+          <m:sSub>
+            <m:e>
+              <m:r>
+                <m:t xml:space="preserve">x</m:t>
+              </m:r>
+            </m:e>
+            <m:sub>
+              <m:r>
+                <m:t xml:space="preserve">k</m:t>
+              </m:r>
+            </m:sub>
+          </m:sSub>
+          <m:r>
+            <m:t xml:space="preserve"> = </m:t>
+          </m:r>
+          <m:rad>
+            <m:radPr>
+              <m:degHide m:val="1"/>
+            </m:radPr>
+            <m:deg/>
+            <m:e>
+              <m:bar>
+                <m:barPr>
+                  <m:pos m:val="top"/>
+                </m:barPr>
+                <m:e>
+                  <m:sSub>
+                    <m:e>
+                      <m:r>
+                        <m:t xml:space="preserve">α</m:t>
+                      </m:r>
+                    </m:e>
+                    <m:sub>
+                      <m:r>
+                        <m:t xml:space="preserve">k</m:t>
+                      </m:r>
+                    </m:sub>
+                  </m:sSub>
+                </m:e>
+              </m:bar>
+            </m:e>
+          </m:rad>
+          <m:r>
+            <m:t xml:space="preserve"> </m:t>
+          </m:r>
+          <m:sSub>
+            <m:e>
+              <m:r>
+                <m:t xml:space="preserve">z</m:t>
+              </m:r>
+            </m:e>
+            <m:sub>
+              <m:r>
+                <m:t xml:space="preserve">target</m:t>
+              </m:r>
+            </m:sub>
+          </m:sSub>
+          <m:r>
+            <m:t xml:space="preserve"> + </m:t>
+          </m:r>
+          <m:rad>
+            <m:radPr>
+              <m:degHide m:val="1"/>
+            </m:radPr>
+            <m:deg/>
+            <m:e>
+              <m:r>
+                <m:t xml:space="preserve">1 − </m:t>
+              </m:r>
+              <m:bar>
+                <m:barPr>
+                  <m:pos m:val="top"/>
+                </m:barPr>
+                <m:e>
+                  <m:sSub>
+                    <m:e>
+                      <m:r>
+                        <m:t xml:space="preserve">α</m:t>
+                      </m:r>
+                    </m:e>
+                    <m:sub>
+                      <m:r>
+                        <m:t xml:space="preserve">k</m:t>
+                      </m:r>
+                    </m:sub>
+                  </m:sSub>
+                </m:e>
+              </m:bar>
+            </m:e>
+          </m:rad>
+          <m:r>
+            <m:t xml:space="preserve"> ε</m:t>
+          </m:r>
+        </m:oMath>
+      </m:oMathPara>
+    </w:p>
+    <w:p>
+      <w:r>
+        <w:t>默认使用 100 层 cosine 噪声日程。带时间嵌入的 MLP 预测噪声，以 MSE 监督；用预测噪声反解干净场景码，裁剪至负 5 到 5 后交给共享预测头。另一路干净目标场景码的重建损失训练编码器和解码器。</w:t>
+      </w:r>
+    </w:p>
+    <w:p>
+      <w:pPr>
+        <w:spacing w:after="160"/>
+      </w:pPr>
+      <m:oMathPara>
+        <m:oMath>
+          <m:sSub>
+            <m:e>
+              <m:r>
+                <m:t xml:space="preserve">L</m:t>
+              </m:r>
+            </m:e>
+            <m:sub>
+              <m:r>
+                <m:t xml:space="preserve">diff</m:t>
+              </m:r>
+            </m:sub>
+          </m:sSub>
+          <m:r>
+            <m:t xml:space="preserve"> = </m:t>
+          </m:r>
+          <m:sSub>
+            <m:e>
+              <m:r>
+                <m:t xml:space="preserve">L</m:t>
+              </m:r>
+            </m:e>
+            <m:sub>
+              <m:r>
+                <m:t xml:space="preserve">pred</m:t>
+              </m:r>
+            </m:sub>
+          </m:sSub>
+          <m:r>
+            <m:t xml:space="preserve"> + </m:t>
+          </m:r>
+          <m:sSub>
+            <m:e>
+              <m:r>
+                <m:t xml:space="preserve">λ</m:t>
+              </m:r>
+            </m:e>
+            <m:sub>
+              <m:r>
+                <m:t xml:space="preserve">rec</m:t>
+              </m:r>
+            </m:sub>
+          </m:sSub>
+          <m:r>
+            <m:t xml:space="preserve"> </m:t>
+          </m:r>
+          <m:sSub>
+            <m:e>
+              <m:r>
+                <m:t xml:space="preserve">L</m:t>
+              </m:r>
+            </m:e>
+            <m:sub>
+              <m:r>
+                <m:t xml:space="preserve">codec</m:t>
+              </m:r>
+            </m:sub>
+          </m:sSub>
+          <m:r>
+            <m:t xml:space="preserve"> + </m:t>
+          </m:r>
+          <m:sSub>
+            <m:e>
+              <m:r>
+                <m:t xml:space="preserve">λ</m:t>
+              </m:r>
+            </m:e>
+            <m:sub>
+              <m:r>
+                <m:t xml:space="preserve">noise</m:t>
+              </m:r>
+            </m:sub>
+          </m:sSub>
+          <m:r>
+            <m:t xml:space="preserve"> </m:t>
+          </m:r>
+          <m:sSub>
+            <m:e>
+              <m:r>
+                <m:t xml:space="preserve">L</m:t>
+              </m:r>
+            </m:e>
+            <m:sub>
+              <m:r>
+                <m:t xml:space="preserve">noise</m:t>
+              </m:r>
+            </m:sub>
+          </m:sSub>
+        </m:oMath>
+      </m:oMathPara>
+    </w:p>
+    <w:p>
+      <w:r>
+        <w:t>默认两个附加权重均为 1。L_pred 与 L_codec 均复用第 5 节的 RGB、几何、属性、mask 和自车重建目标。训练内部使用上一真实场景和目标场景码进行 teacher forcing；未来目标仅由 training_loss 接收。</w:t>
+      </w:r>
+    </w:p>
+    <w:p>
+      <w:pPr>
+        <w:pStyle w:val="Heading2"/>
+        <w:pageBreakBefore w:val="0"/>
+      </w:pPr>
+      <w:r>
+        <w:t>逐步采样与表示限制</w:t>
+      </w:r>
+    </w:p>
+    <w:p>
+      <w:r>
+        <w:t>推理从随机高斯噪声开始，按子采样 DDIM 日程迭代去噪，eta=0，默认每个未来时刻调用 20 次 denoiser。不同初始噪声形成不同未来；下一时刻递归使用预测场景码及预测输出。sample=False 使用全零初始噪声，不代表解码后未来分布的均值。</w:t>
+      </w:r>
+    </w:p>
+    <w:p>
+      <w:r>
+        <w:t>场景编码器是联合学习的初始 codec，尚未单独预训练或验证；需检查潜空间退化、重建瓶颈和 teacher forcing 暴露偏差。实现位于 models/diffusion.py。该框架不构成 Diffusion 已优于 RSSM 或 GRU 的实验证据。</w:t>
+      </w:r>
+    </w:p>
+    <w:p>
+      <w:pPr>
+        <w:pStyle w:val="Heading1"/>
+        <w:pageBreakBefore/>
+      </w:pPr>
+      <w:r>
+        <w:t>12 统一实验与资源测量</w:t>
+      </w:r>
+    </w:p>
+    <w:p>
+      <w:r>
+        <w:t>models.build_world_model 统一构建 gru、rssm 与 diffusion。三者共用数据字段、几何运动先验和输出头代码，权重分别训练。训练与检查点记录 backend 和 model_options，evaluate、demo、serve 自动恢复对应实现；旧检查点缺少后端字段时保持 GRU 行为。</w:t>
+      </w:r>
+    </w:p>
+    <w:tbl>
+      <w:tblPr>
+        <w:tblW w:type="auto" w:w="0"/>
+        <w:tblLayout w:type="fixed"/>
+        <w:tblLook w:firstColumn="1" w:firstRow="1" w:lastColumn="0" w:lastRow="0" w:noHBand="0" w:noVBand="1" w:val="04A0"/>
+      </w:tblPr>
+      <w:tblGrid>
+        <w:gridCol w:w="1191"/>
+        <w:gridCol w:w="2608"/>
+        <w:gridCol w:w="2948"/>
+        <w:gridCol w:w="2891"/>
+      </w:tblGrid>
+      <w:tr>
+        <w:trPr>
+          <w:tblHeader/>
+        </w:trPr>
+        <w:tc>
+          <w:tcPr>
+            <w:tcW w:type="dxa" w:w="1191"/>
+            <w:vAlign w:val="center"/>
+            <w:tcBorders>
+              <w:top w:val="single" w:sz="4" w:color="D9D9D9"/>
+              <w:left w:val="single" w:sz="4" w:color="D9D9D9"/>
+              <w:bottom w:val="single" w:sz="4" w:color="D9D9D9"/>
+              <w:right w:val="single" w:sz="4" w:color="D9D9D9"/>
+            </w:tcBorders>
+            <w:tcMar>
+              <w:top w:w="90" w:type="dxa"/>
+              <w:left w:w="90" w:type="dxa"/>
+              <w:bottom w:w="90" w:type="dxa"/>
+              <w:right w:w="90" w:type="dxa"/>
+            </w:tcMar>
+            <w:shd w:fill="E8EDF2"/>
+          </w:tcPr>
+          <w:p>
+            <w:pPr>
+              <w:spacing w:after="60" w:before="60"/>
+            </w:pPr>
+            <w:r>
+              <w:rPr>
+                <w:b/>
+                <w:color w:val="000000"/>
+                <w:sz w:val="19"/>
+              </w:rPr>
+              <w:t>后端</w:t>
+            </w:r>
+          </w:p>
+        </w:tc>
+        <w:tc>
+          <w:tcPr>
+            <w:tcW w:type="dxa" w:w="2608"/>
+            <w:vAlign w:val="center"/>
+            <w:tcBorders>
+              <w:top w:val="single" w:sz="4" w:color="D9D9D9"/>
+              <w:left w:val="single" w:sz="4" w:color="D9D9D9"/>
+              <w:bottom w:val="single" w:sz="4" w:color="D9D9D9"/>
+              <w:right w:val="single" w:sz="4" w:color="D9D9D9"/>
+            </w:tcBorders>
+            <w:tcMar>
+              <w:top w:w="90" w:type="dxa"/>
+              <w:left w:w="90" w:type="dxa"/>
+              <w:bottom w:w="90" w:type="dxa"/>
+              <w:right w:w="90" w:type="dxa"/>
+            </w:tcMar>
+            <w:shd w:fill="E8EDF2"/>
+          </w:tcPr>
+          <w:p>
+            <w:pPr>
+              <w:spacing w:after="60" w:before="60"/>
+            </w:pPr>
+            <w:r>
+              <w:rPr>
+                <w:b/>
+                <w:color w:val="000000"/>
+                <w:sz w:val="19"/>
+              </w:rPr>
+              <w:t>状态演化</w:t>
+            </w:r>
+          </w:p>
+        </w:tc>
+        <w:tc>
+          <w:tcPr>
+            <w:tcW w:type="dxa" w:w="2948"/>
+            <w:vAlign w:val="center"/>
+            <w:tcBorders>
+              <w:top w:val="single" w:sz="4" w:color="D9D9D9"/>
+              <w:left w:val="single" w:sz="4" w:color="D9D9D9"/>
+              <w:bottom w:val="single" w:sz="4" w:color="D9D9D9"/>
+              <w:right w:val="single" w:sz="4" w:color="D9D9D9"/>
+            </w:tcBorders>
+            <w:tcMar>
+              <w:top w:w="90" w:type="dxa"/>
+              <w:left w:w="90" w:type="dxa"/>
+              <w:bottom w:w="90" w:type="dxa"/>
+              <w:right w:w="90" w:type="dxa"/>
+            </w:tcMar>
+            <w:shd w:fill="E8EDF2"/>
+          </w:tcPr>
+          <w:p>
+            <w:pPr>
+              <w:spacing w:after="60" w:before="60"/>
+            </w:pPr>
+            <w:r>
+              <w:rPr>
+                <w:b/>
+                <w:color w:val="000000"/>
+                <w:sz w:val="19"/>
+              </w:rPr>
+              <w:t>额外训练目标</w:t>
+            </w:r>
+          </w:p>
+        </w:tc>
+        <w:tc>
+          <w:tcPr>
+            <w:tcW w:type="dxa" w:w="2891"/>
+            <w:vAlign w:val="center"/>
+            <w:tcBorders>
+              <w:top w:val="single" w:sz="4" w:color="D9D9D9"/>
+              <w:left w:val="single" w:sz="4" w:color="D9D9D9"/>
+              <w:bottom w:val="single" w:sz="4" w:color="D9D9D9"/>
+              <w:right w:val="single" w:sz="4" w:color="D9D9D9"/>
+            </w:tcBorders>
+            <w:tcMar>
+              <w:top w:w="90" w:type="dxa"/>
+              <w:left w:w="90" w:type="dxa"/>
+              <w:bottom w:w="90" w:type="dxa"/>
+              <w:right w:w="90" w:type="dxa"/>
+            </w:tcMar>
+            <w:shd w:fill="E8EDF2"/>
+          </w:tcPr>
+          <w:p>
+            <w:pPr>
+              <w:spacing w:after="60" w:before="60"/>
+            </w:pPr>
+            <w:r>
+              <w:rPr>
+                <w:b/>
+                <w:color w:val="000000"/>
+                <w:sz w:val="19"/>
+              </w:rPr>
+              <w:t>默认未来单步计算</w:t>
+            </w:r>
+          </w:p>
+        </w:tc>
+      </w:tr>
+      <w:tr>
+        <w:tc>
+          <w:tcPr>
+            <w:tcW w:type="dxa" w:w="1191"/>
+            <w:vAlign w:val="center"/>
+            <w:tcBorders>
+              <w:top w:val="single" w:sz="4" w:color="D9D9D9"/>
+              <w:left w:val="single" w:sz="4" w:color="D9D9D9"/>
+              <w:bottom w:val="single" w:sz="4" w:color="D9D9D9"/>
+              <w:right w:val="single" w:sz="4" w:color="D9D9D9"/>
+            </w:tcBorders>
+            <w:tcMar>
+              <w:top w:w="90" w:type="dxa"/>
+              <w:left w:w="90" w:type="dxa"/>
+              <w:bottom w:w="90" w:type="dxa"/>
+              <w:right w:w="90" w:type="dxa"/>
+            </w:tcMar>
+          </w:tcPr>
+          <w:p>
+            <w:pPr>
+              <w:spacing w:after="60" w:before="60"/>
+            </w:pPr>
+            <w:r>
+              <w:rPr>
+                <w:sz w:val="19"/>
+              </w:rPr>
+              <w:t>GRU</w:t>
+            </w:r>
+          </w:p>
+        </w:tc>
+        <w:tc>
+          <w:tcPr>
+            <w:tcW w:type="dxa" w:w="2608"/>
+            <w:vAlign w:val="center"/>
+            <w:tcBorders>
+              <w:top w:val="single" w:sz="4" w:color="D9D9D9"/>
+              <w:left w:val="single" w:sz="4" w:color="D9D9D9"/>
+              <w:bottom w:val="single" w:sz="4" w:color="D9D9D9"/>
+              <w:right w:val="single" w:sz="4" w:color="D9D9D9"/>
+            </w:tcBorders>
+            <w:tcMar>
+              <w:top w:w="90" w:type="dxa"/>
+              <w:left w:w="90" w:type="dxa"/>
+              <w:bottom w:w="90" w:type="dxa"/>
+              <w:right w:w="90" w:type="dxa"/>
+            </w:tcMar>
+          </w:tcPr>
+          <w:p>
+            <w:pPr>
+              <w:spacing w:after="60" w:before="60"/>
+            </w:pPr>
+            <w:r>
+              <w:rPr>
+                <w:sz w:val="19"/>
+              </w:rPr>
+              <w:t>确定性隐状态</w:t>
+            </w:r>
+          </w:p>
+        </w:tc>
+        <w:tc>
+          <w:tcPr>
+            <w:tcW w:type="dxa" w:w="2948"/>
+            <w:vAlign w:val="center"/>
+            <w:tcBorders>
+              <w:top w:val="single" w:sz="4" w:color="D9D9D9"/>
+              <w:left w:val="single" w:sz="4" w:color="D9D9D9"/>
+              <w:bottom w:val="single" w:sz="4" w:color="D9D9D9"/>
+              <w:right w:val="single" w:sz="4" w:color="D9D9D9"/>
+            </w:tcBorders>
+            <w:tcMar>
+              <w:top w:w="90" w:type="dxa"/>
+              <w:left w:w="90" w:type="dxa"/>
+              <w:bottom w:w="90" w:type="dxa"/>
+              <w:right w:w="90" w:type="dxa"/>
+            </w:tcMar>
+          </w:tcPr>
+          <w:p>
+            <w:pPr>
+              <w:spacing w:after="60" w:before="60"/>
+            </w:pPr>
+            <w:r>
+              <w:rPr>
+                <w:sz w:val="19"/>
+              </w:rPr>
+              <w:t>无</w:t>
+            </w:r>
+          </w:p>
+        </w:tc>
+        <w:tc>
+          <w:tcPr>
+            <w:tcW w:type="dxa" w:w="2891"/>
+            <w:vAlign w:val="center"/>
+            <w:tcBorders>
+              <w:top w:val="single" w:sz="4" w:color="D9D9D9"/>
+              <w:left w:val="single" w:sz="4" w:color="D9D9D9"/>
+              <w:bottom w:val="single" w:sz="4" w:color="D9D9D9"/>
+              <w:right w:val="single" w:sz="4" w:color="D9D9D9"/>
+            </w:tcBorders>
+            <w:tcMar>
+              <w:top w:w="90" w:type="dxa"/>
+              <w:left w:w="90" w:type="dxa"/>
+              <w:bottom w:w="90" w:type="dxa"/>
+              <w:right w:w="90" w:type="dxa"/>
+            </w:tcMar>
+          </w:tcPr>
+          <w:p>
+            <w:pPr>
+              <w:spacing w:after="60" w:before="60"/>
+            </w:pPr>
+            <w:r>
+              <w:rPr>
+                <w:sz w:val="19"/>
+              </w:rPr>
+              <w:t>一次动力学 GRU</w:t>
+            </w:r>
+          </w:p>
+        </w:tc>
+      </w:tr>
+      <w:tr>
+        <w:tc>
+          <w:tcPr>
+            <w:tcW w:type="dxa" w:w="1191"/>
+            <w:vAlign w:val="center"/>
+            <w:tcBorders>
+              <w:top w:val="single" w:sz="4" w:color="D9D9D9"/>
+              <w:left w:val="single" w:sz="4" w:color="D9D9D9"/>
+              <w:bottom w:val="single" w:sz="4" w:color="D9D9D9"/>
+              <w:right w:val="single" w:sz="4" w:color="D9D9D9"/>
+            </w:tcBorders>
+            <w:tcMar>
+              <w:top w:w="90" w:type="dxa"/>
+              <w:left w:w="90" w:type="dxa"/>
+              <w:bottom w:w="90" w:type="dxa"/>
+              <w:right w:w="90" w:type="dxa"/>
+            </w:tcMar>
+          </w:tcPr>
+          <w:p>
+            <w:pPr>
+              <w:spacing w:after="60" w:before="60"/>
+            </w:pPr>
+            <w:r>
+              <w:rPr>
+                <w:sz w:val="19"/>
+              </w:rPr>
+              <w:t>RSSM</w:t>
+            </w:r>
+          </w:p>
+        </w:tc>
+        <w:tc>
+          <w:tcPr>
+            <w:tcW w:type="dxa" w:w="2608"/>
+            <w:vAlign w:val="center"/>
+            <w:tcBorders>
+              <w:top w:val="single" w:sz="4" w:color="D9D9D9"/>
+              <w:left w:val="single" w:sz="4" w:color="D9D9D9"/>
+              <w:bottom w:val="single" w:sz="4" w:color="D9D9D9"/>
+              <w:right w:val="single" w:sz="4" w:color="D9D9D9"/>
+            </w:tcBorders>
+            <w:tcMar>
+              <w:top w:w="90" w:type="dxa"/>
+              <w:left w:w="90" w:type="dxa"/>
+              <w:bottom w:w="90" w:type="dxa"/>
+              <w:right w:w="90" w:type="dxa"/>
+            </w:tcMar>
+          </w:tcPr>
+          <w:p>
+            <w:pPr>
+              <w:spacing w:after="60" w:before="60"/>
+            </w:pPr>
+            <w:r>
+              <w:rPr>
+                <w:sz w:val="19"/>
+              </w:rPr>
+              <w:t>确定性状态与随机 z</w:t>
+            </w:r>
+          </w:p>
+        </w:tc>
+        <w:tc>
+          <w:tcPr>
+            <w:tcW w:type="dxa" w:w="2948"/>
+            <w:vAlign w:val="center"/>
+            <w:tcBorders>
+              <w:top w:val="single" w:sz="4" w:color="D9D9D9"/>
+              <w:left w:val="single" w:sz="4" w:color="D9D9D9"/>
+              <w:bottom w:val="single" w:sz="4" w:color="D9D9D9"/>
+              <w:right w:val="single" w:sz="4" w:color="D9D9D9"/>
+            </w:tcBorders>
+            <w:tcMar>
+              <w:top w:w="90" w:type="dxa"/>
+              <w:left w:w="90" w:type="dxa"/>
+              <w:bottom w:w="90" w:type="dxa"/>
+              <w:right w:w="90" w:type="dxa"/>
+            </w:tcMar>
+          </w:tcPr>
+          <w:p>
+            <w:pPr>
+              <w:spacing w:after="60" w:before="60"/>
+            </w:pPr>
+            <w:r>
+              <w:rPr>
+                <w:sz w:val="19"/>
+              </w:rPr>
+              <w:t>后验重建和 balanced KL</w:t>
+            </w:r>
+          </w:p>
+        </w:tc>
+        <w:tc>
+          <w:tcPr>
+            <w:tcW w:type="dxa" w:w="2891"/>
+            <w:vAlign w:val="center"/>
+            <w:tcBorders>
+              <w:top w:val="single" w:sz="4" w:color="D9D9D9"/>
+              <w:left w:val="single" w:sz="4" w:color="D9D9D9"/>
+              <w:bottom w:val="single" w:sz="4" w:color="D9D9D9"/>
+              <w:right w:val="single" w:sz="4" w:color="D9D9D9"/>
+            </w:tcBorders>
+            <w:tcMar>
+              <w:top w:w="90" w:type="dxa"/>
+              <w:left w:w="90" w:type="dxa"/>
+              <w:bottom w:w="90" w:type="dxa"/>
+              <w:right w:w="90" w:type="dxa"/>
+            </w:tcMar>
+          </w:tcPr>
+          <w:p>
+            <w:pPr>
+              <w:spacing w:after="60" w:before="60"/>
+            </w:pPr>
+            <w:r>
+              <w:rPr>
+                <w:sz w:val="19"/>
+              </w:rPr>
+              <w:t>GRU 与先验采样</w:t>
+            </w:r>
+          </w:p>
+        </w:tc>
+      </w:tr>
+      <w:tr>
+        <w:tc>
+          <w:tcPr>
+            <w:tcW w:type="dxa" w:w="1191"/>
+            <w:vAlign w:val="center"/>
+            <w:tcBorders>
+              <w:top w:val="single" w:sz="4" w:color="D9D9D9"/>
+              <w:left w:val="single" w:sz="4" w:color="D9D9D9"/>
+              <w:bottom w:val="single" w:sz="4" w:color="D9D9D9"/>
+              <w:right w:val="single" w:sz="4" w:color="D9D9D9"/>
+            </w:tcBorders>
+            <w:tcMar>
+              <w:top w:w="90" w:type="dxa"/>
+              <w:left w:w="90" w:type="dxa"/>
+              <w:bottom w:w="90" w:type="dxa"/>
+              <w:right w:w="90" w:type="dxa"/>
+            </w:tcMar>
+          </w:tcPr>
+          <w:p>
+            <w:pPr>
+              <w:spacing w:after="60" w:before="60"/>
+            </w:pPr>
+            <w:r>
+              <w:rPr>
+                <w:sz w:val="19"/>
+              </w:rPr>
+              <w:t>Diffusion</w:t>
+            </w:r>
+          </w:p>
+        </w:tc>
+        <w:tc>
+          <w:tcPr>
+            <w:tcW w:type="dxa" w:w="2608"/>
+            <w:vAlign w:val="center"/>
+            <w:tcBorders>
+              <w:top w:val="single" w:sz="4" w:color="D9D9D9"/>
+              <w:left w:val="single" w:sz="4" w:color="D9D9D9"/>
+              <w:bottom w:val="single" w:sz="4" w:color="D9D9D9"/>
+              <w:right w:val="single" w:sz="4" w:color="D9D9D9"/>
+            </w:tcBorders>
+            <w:tcMar>
+              <w:top w:w="90" w:type="dxa"/>
+              <w:left w:w="90" w:type="dxa"/>
+              <w:bottom w:w="90" w:type="dxa"/>
+              <w:right w:w="90" w:type="dxa"/>
+            </w:tcMar>
+          </w:tcPr>
+          <w:p>
+            <w:pPr>
+              <w:spacing w:after="60" w:before="60"/>
+            </w:pPr>
+            <w:r>
+              <w:rPr>
+                <w:sz w:val="19"/>
+              </w:rPr>
+              <w:t>条件场景码分布</w:t>
+            </w:r>
+          </w:p>
+        </w:tc>
+        <w:tc>
+          <w:tcPr>
+            <w:tcW w:type="dxa" w:w="2948"/>
+            <w:vAlign w:val="center"/>
+            <w:tcBorders>
+              <w:top w:val="single" w:sz="4" w:color="D9D9D9"/>
+              <w:left w:val="single" w:sz="4" w:color="D9D9D9"/>
+              <w:bottom w:val="single" w:sz="4" w:color="D9D9D9"/>
+              <w:right w:val="single" w:sz="4" w:color="D9D9D9"/>
+            </w:tcBorders>
+            <w:tcMar>
+              <w:top w:w="90" w:type="dxa"/>
+              <w:left w:w="90" w:type="dxa"/>
+              <w:bottom w:w="90" w:type="dxa"/>
+              <w:right w:w="90" w:type="dxa"/>
+            </w:tcMar>
+          </w:tcPr>
+          <w:p>
+            <w:pPr>
+              <w:spacing w:after="60" w:before="60"/>
+            </w:pPr>
+            <w:r>
+              <w:rPr>
+                <w:sz w:val="19"/>
+              </w:rPr>
+              <w:t>噪声预测及 codec 重建</w:t>
+            </w:r>
+          </w:p>
+        </w:tc>
+        <w:tc>
+          <w:tcPr>
+            <w:tcW w:type="dxa" w:w="2891"/>
+            <w:vAlign w:val="center"/>
+            <w:tcBorders>
+              <w:top w:val="single" w:sz="4" w:color="D9D9D9"/>
+              <w:left w:val="single" w:sz="4" w:color="D9D9D9"/>
+              <w:bottom w:val="single" w:sz="4" w:color="D9D9D9"/>
+              <w:right w:val="single" w:sz="4" w:color="D9D9D9"/>
+            </w:tcBorders>
+            <w:tcMar>
+              <w:top w:w="90" w:type="dxa"/>
+              <w:left w:w="90" w:type="dxa"/>
+              <w:bottom w:w="90" w:type="dxa"/>
+              <w:right w:w="90" w:type="dxa"/>
+            </w:tcMar>
+          </w:tcPr>
+          <w:p>
+            <w:pPr>
+              <w:spacing w:after="60" w:before="60"/>
+            </w:pPr>
+            <w:r>
+              <w:rPr>
+                <w:sz w:val="19"/>
+              </w:rPr>
+              <w:t>GRU 与 20 次去噪</w:t>
+            </w:r>
+          </w:p>
+        </w:tc>
+      </w:tr>
+    </w:tbl>
+    <w:p>
+      <w:pPr>
+        <w:spacing w:after="40"/>
+      </w:pPr>
+    </w:p>
+    <w:p>
+      <w:pPr>
+        <w:pStyle w:val="Heading2"/>
+        <w:pageBreakBefore w:val="0"/>
+      </w:pPr>
+      <w:r>
+        <w:t>公平比较与采样协议</w:t>
+      </w:r>
+    </w:p>
+    <w:p>
+      <w:r>
+        <w:t>configs/comparison.json 保持数据缓存、日志划分、历史长度、预测时域和优化步数一致。相同 hidden 不代表参数量或计算预算相同；需补充匹配参数量和计算量、多随机种子及长时域实验。训练总损失因附加目标不同而不能直接排名。</w:t>
+      </w:r>
+    </w:p>
+    <w:p>
+      <w:r>
+        <w:t>随机后端支持局部 generator 与固定 seed 采样。evaluate 的 samples 参数在普通首样本指标之外，报告平均样本 ADE、best of K ADE 与轨迹离散度；比较时固定 K，不能仅选最佳样本证明质量。应同时核对动作响应、伪几何误差和独立 LiDAR 诊断。</w:t>
+      </w:r>
+    </w:p>
+    <w:p>
+      <w:pPr>
+        <w:pStyle w:val="Heading2"/>
+        <w:pageBreakBefore w:val="0"/>
+      </w:pPr>
+      <w:r>
+        <w:t>资源测量与验证状态</w:t>
+      </w:r>
+    </w:p>
+    <w:p>
+      <w:r>
+        <w:t>profile 命令已提供参数量、同步推理延迟、吞吐率和 CUDA 峰值 allocated/reserved 统计。每个后端和采样配置应在独立进程运行；测量包含历史编码与未来采样，不包含 DGGT、数据加载或训练，allocator 数值也不等于整卡总占用。</w:t>
+      </w:r>
+    </w:p>
+    <w:p>
+      <w:r>
+        <w:t>2026 年 10 月 21 日，服务器 Python 3.10 与 PyTorch 2.4.1+cu124 环境通过 54 项轻量测试，覆盖梯度、因果协议、采样复现、检查点、服务、采集预算和续传恢复。本次未执行 GPU 训练或显存延迟测试，也未在新数据上生成性能结论。</w:t>
+      </w:r>
+    </w:p>
+    <w:p>
+      <w:r>
+        <w:t>参考：PlaNet arXiv 1811.04551；DreamerV2 arXiv 2010.02193；DDPM arXiv 2006.11239；DDIM arXiv 2010.02502。详细配置、命令与实现限制见 README 和 docs/WORLD_MODEL_BACKENDS.md。</w:t>
       </w:r>
     </w:p>
     <w:sectPr>

</xml_diff>

<commit_message>
Validate driving data and remove teacher geometry from RGB-only diffusion
</commit_message>
<xml_diff>
--- a/docs/World_Model.docx
+++ b/docs/World_Model.docx
@@ -1206,7 +1206,7 @@
     </w:p>
     <w:p>
       <w:r>
-        <w:t>默认两个附加权重均为 1。L_pred 与 L_codec 均复用第 5 节的 RGB、几何、属性、mask 和自车重建目标。训练内部使用上一真实场景和目标场景码进行 teacher forcing；未来目标仅由 training_loss 接收。</w:t>
+        <w:t>默认两个附加权重均为 1。L_pred 与 L_codec 均复用第 5 节的 RGB、几何、属性、mask 和自车重建目标。完整模型在训练内部使用上一真实场景和目标场景码进行 teacher forcing；RGB-only 分支用预测几何递推，真实几何只作损失目标。未来目标仅由 training_loss 接收。</w:t>
       </w:r>
     </w:p>
     <w:p>
@@ -1782,7 +1782,7 @@
     </w:p>
     <w:p>
       <w:r>
-        <w:t>2026 年 10 月 21 日，服务器 Python 3.10 与 PyTorch 2.4.1+cu124 环境通过 54 项轻量测试，覆盖梯度、因果协议、采样复现、检查点、服务、采集预算和续传恢复。本次未执行 GPU 训练或显存延迟测试，也未在新数据上生成性能结论。</w:t>
+        <w:t>2026 年 10 月 21 日，服务器 Python 3.10 与 PyTorch 2.4.1+cu124 环境通过 55 项轻量测试，覆盖梯度、因果协议、采样复现、检查点、服务、采集预算和续传恢复。本次未执行 GPU 训练或显存延迟测试，也未在新数据上生成性能结论。</w:t>
       </w:r>
     </w:p>
     <w:p>

</xml_diff>